<commit_message>
informes y documento de referencia
</commit_message>
<xml_diff>
--- a/custom-reference-doc.docx
+++ b/custom-reference-doc.docx
@@ -415,20 +415,6 @@
       <w:r>
         <w:t>Normal</w:t>
       </w:r>
-    </w:p>
-    <w:p/>
-    <w:p>
-      <w:pPr>
-        <w:pStyle w:val="Resaltador"/>
-      </w:pPr>
-      <w:proofErr w:type="spellStart"/>
-      <w:r>
-        <w:rPr>
-          <w:highlight w:val="yellow"/>
-        </w:rPr>
-        <w:t>Resaltador</w:t>
-      </w:r>
-      <w:proofErr w:type="spellEnd"/>
     </w:p>
     <w:sectPr>
       <w:headerReference w:type="even" r:id="rId9"/>
@@ -1682,12 +1668,12 @@
     <w:basedOn w:val="FirstParagraph"/>
     <w:next w:val="BodyText"/>
     <w:qFormat/>
-    <w:rsid w:val="00F465B7"/>
+    <w:rsid w:val="007B1689"/>
     <w:pPr>
       <w:keepNext/>
       <w:keepLines/>
       <w:framePr w:wrap="notBeside" w:vAnchor="text" w:hAnchor="text" w:y="1"/>
-      <w:spacing w:before="940" w:after="1140"/>
+      <w:spacing w:before="1300" w:after="1500"/>
     </w:pPr>
     <w:rPr>
       <w:szCs w:val="20"/>
@@ -2100,11 +2086,12 @@
     <w:basedOn w:val="Normal"/>
     <w:autoRedefine/>
     <w:qFormat/>
-    <w:rsid w:val="000C0338"/>
+    <w:rsid w:val="005A4843"/>
     <w:rPr>
       <w:rFonts w:ascii="Fira Code" w:hAnsi="Fira Code"/>
       <w:b/>
       <w:color w:val="EE0000"/>
+      <w:u w:val="single"/>
     </w:rPr>
   </w:style>
 </w:styles>

</xml_diff>